<commit_message>
job-up: consolida candidaturas y plantillas
</commit_message>
<xml_diff>
--- a/boveda-entrevista-profesional/busqueda-empleo/proceso/plantillas/TEMPLATE_CV_FORMATO.docx
+++ b/boveda-entrevista-profesional/busqueda-empleo/proceso/plantillas/TEMPLATE_CV_FORMATO.docx
@@ -17,14 +17,14 @@
         <w:tblLook w:val="04a0" w:firstRow="1" w:noVBand="1" w:lastRow="0" w:firstColumn="1" w:lastColumn="0" w:noHBand="0"/>
       </w:tblPr>
       <w:tblGrid>
-        <w:gridCol w:w="8278"/>
-        <w:gridCol w:w="1802"/>
+        <w:gridCol w:w="8276"/>
+        <w:gridCol w:w="1804"/>
       </w:tblGrid>
       <w:tr>
         <w:trPr/>
         <w:tc>
           <w:tcPr>
-            <w:tcW w:w="8278" w:type="dxa"/>
+            <w:tcW w:w="8276" w:type="dxa"/>
             <w:tcBorders/>
             <w:vAlign w:val="center"/>
           </w:tcPr>
@@ -33,7 +33,13 @@
               <w:pStyle w:val="Normal"/>
               <w:spacing w:lineRule="auto" w:line="240" w:before="0" w:after="20"/>
               <w:jc w:val="start"/>
-              <w:rPr/>
+              <w:rPr>
+                <w:rFonts w:eastAsia="Calibri"/>
+                <w:b/>
+                <w:i w:val="false"/>
+                <w:color w:val="1F2937"/>
+                <w:sz w:val="36"/>
+              </w:rPr>
             </w:pPr>
             <w:r>
               <w:rPr>
@@ -51,7 +57,13 @@
               <w:pStyle w:val="Normal"/>
               <w:spacing w:lineRule="auto" w:line="240" w:before="0" w:after="40"/>
               <w:jc w:val="start"/>
-              <w:rPr/>
+              <w:rPr>
+                <w:rFonts w:eastAsia="Calibri"/>
+                <w:b w:val="false"/>
+                <w:i w:val="false"/>
+                <w:color w:val="5B6573"/>
+                <w:sz w:val="22"/>
+              </w:rPr>
             </w:pPr>
             <w:r>
               <w:rPr>
@@ -85,7 +97,7 @@
         </w:tc>
         <w:tc>
           <w:tcPr>
-            <w:tcW w:w="1802" w:type="dxa"/>
+            <w:tcW w:w="1804" w:type="dxa"/>
             <w:tcBorders/>
             <w:vAlign w:val="center"/>
           </w:tcPr>
@@ -157,14 +169,16 @@
         <w:pStyle w:val="Heading1"/>
         <w:spacing w:lineRule="auto" w:line="240" w:before="120" w:after="40"/>
         <w:jc w:val="start"/>
-        <w:rPr/>
+        <w:rPr>
+          <w:color w:val="2A6099"/>
+        </w:rPr>
       </w:pPr>
       <w:r>
         <w:rPr>
           <w:rFonts w:eastAsia="Calibri"/>
           <w:b/>
           <w:i w:val="false"/>
-          <w:color w:val="1F2937"/>
+          <w:color w:val="2A6099"/>
           <w:sz w:val="28"/>
         </w:rPr>
         <w:t>PERFIL PROFESIONAL</w:t>
@@ -193,14 +207,16 @@
         <w:pStyle w:val="Heading1"/>
         <w:spacing w:lineRule="auto" w:line="240" w:before="120" w:after="40"/>
         <w:jc w:val="start"/>
-        <w:rPr/>
+        <w:rPr>
+          <w:color w:val="2A6099"/>
+        </w:rPr>
       </w:pPr>
       <w:r>
         <w:rPr>
           <w:rFonts w:eastAsia="Calibri"/>
           <w:b/>
           <w:i w:val="false"/>
-          <w:color w:val="1F2937"/>
+          <w:color w:val="2A6099"/>
           <w:sz w:val="28"/>
         </w:rPr>
         <w:t>PROPUESTA DE VALOR</w:t>
@@ -229,14 +245,16 @@
         <w:pStyle w:val="Heading1"/>
         <w:spacing w:lineRule="auto" w:line="240" w:before="120" w:after="40"/>
         <w:jc w:val="start"/>
-        <w:rPr/>
+        <w:rPr>
+          <w:color w:val="2A6099"/>
+        </w:rPr>
       </w:pPr>
       <w:r>
         <w:rPr>
           <w:rFonts w:eastAsia="Calibri"/>
           <w:b/>
           <w:i w:val="false"/>
-          <w:color w:val="1F2937"/>
+          <w:color w:val="2A6099"/>
           <w:sz w:val="28"/>
         </w:rPr>
         <w:t>EXPERIENCIA PROFESIONAL RELEVANTE</w:t>
@@ -405,14 +423,16 @@
         <w:pStyle w:val="Heading1"/>
         <w:spacing w:lineRule="auto" w:line="240" w:before="120" w:after="40"/>
         <w:jc w:val="start"/>
-        <w:rPr/>
+        <w:rPr>
+          <w:color w:val="2A6099"/>
+        </w:rPr>
       </w:pPr>
       <w:r>
         <w:rPr>
           <w:rFonts w:eastAsia="Calibri"/>
           <w:b/>
           <w:i w:val="false"/>
-          <w:color w:val="1F2937"/>
+          <w:color w:val="2A6099"/>
           <w:sz w:val="28"/>
         </w:rPr>
         <w:t>COMPETENCIAS Y HERRAMIENTAS</w:t>
@@ -515,14 +535,16 @@
         <w:pStyle w:val="Heading1"/>
         <w:spacing w:lineRule="auto" w:line="240" w:before="120" w:after="40"/>
         <w:jc w:val="start"/>
-        <w:rPr/>
+        <w:rPr>
+          <w:color w:val="2A6099"/>
+        </w:rPr>
       </w:pPr>
       <w:r>
         <w:rPr>
           <w:rFonts w:eastAsia="Calibri"/>
           <w:b/>
           <w:i w:val="false"/>
-          <w:color w:val="1F2937"/>
+          <w:color w:val="2A6099"/>
           <w:sz w:val="28"/>
         </w:rPr>
         <w:t>FORMACIÓN</w:t>
@@ -617,14 +639,16 @@
         <w:pStyle w:val="Heading1"/>
         <w:spacing w:lineRule="auto" w:line="240" w:before="120" w:after="40"/>
         <w:jc w:val="start"/>
-        <w:rPr/>
+        <w:rPr>
+          <w:color w:val="2A6099"/>
+        </w:rPr>
       </w:pPr>
       <w:r>
         <w:rPr>
           <w:rFonts w:eastAsia="Calibri"/>
           <w:b/>
           <w:i w:val="false"/>
-          <w:color w:val="1F2937"/>
+          <w:color w:val="2A6099"/>
           <w:sz w:val="28"/>
         </w:rPr>
         <w:t>INFORMACIÓN ADICIONAL</w:t>
@@ -1917,19 +1941,21 @@
       <w:keepNext w:val="true"/>
       <w:keepLines/>
       <w:pBdr>
-        <w:bottom w:val="single" w:sz="6" w:space="1" w:color="000000"/>
+        <w:bottom w:val="single" w:sz="6" w:space="1" w:color="2A6099"/>
       </w:pBdr>
       <w:spacing w:before="140" w:after="40"/>
-      <w:jc w:val="both"/>
+      <w:jc w:val="start"/>
       <w:outlineLvl w:val="0"/>
     </w:pPr>
     <w:rPr>
       <w:rFonts w:ascii="Calibri" w:hAnsi="Calibri" w:eastAsia="" w:cs="" w:asciiTheme="majorHAnsi" w:cstheme="majorBidi" w:eastAsiaTheme="majorEastAsia" w:hAnsiTheme="majorHAnsi"/>
       <w:b/>
       <w:bCs/>
-      <w:color w:val="1F2937"/>
+      <w:caps/>
+      <w:color w:val="0F4761"/>
       <w:sz w:val="28"/>
       <w:szCs w:val="28"/>
+      <w:u w:val="none" w:color="000000"/>
       <w:lang w:val="es-ES"/>
     </w:rPr>
   </w:style>

</xml_diff>

<commit_message>
chore: consolidar cambios pendientes de Job-up
</commit_message>
<xml_diff>
--- a/boveda-entrevista-profesional/busqueda-empleo/proceso/plantillas/TEMPLATE_CV_FORMATO.docx
+++ b/boveda-entrevista-profesional/busqueda-empleo/proceso/plantillas/TEMPLATE_CV_FORMATO.docx
@@ -17,14 +17,14 @@
         <w:tblLook w:val="04a0" w:firstRow="1" w:noVBand="1" w:lastRow="0" w:firstColumn="1" w:lastColumn="0" w:noHBand="0"/>
       </w:tblPr>
       <w:tblGrid>
-        <w:gridCol w:w="8275"/>
-        <w:gridCol w:w="1805"/>
+        <w:gridCol w:w="8274"/>
+        <w:gridCol w:w="1806"/>
       </w:tblGrid>
       <w:tr>
         <w:trPr/>
         <w:tc>
           <w:tcPr>
-            <w:tcW w:w="8275" w:type="dxa"/>
+            <w:tcW w:w="8274" w:type="dxa"/>
             <w:tcBorders/>
             <w:vAlign w:val="center"/>
           </w:tcPr>
@@ -95,7 +95,7 @@
         </w:tc>
         <w:tc>
           <w:tcPr>
-            <w:tcW w:w="1805" w:type="dxa"/>
+            <w:tcW w:w="1806" w:type="dxa"/>
             <w:tcBorders/>
             <w:vAlign w:val="center"/>
           </w:tcPr>
@@ -280,29 +280,18 @@
           <w:color w:val="1F2937"/>
           <w:sz w:val="22"/>
         </w:rPr>
-        <w:t xml:space="preserve">[EXPERIENCIA </w:t>
+        <w:t>[EXPERIENCIA 1 CABECERA]</w:t>
       </w:r>
       <w:r>
         <w:rPr>
           <w:rFonts w:eastAsia="Calibri"/>
-          <w:b/>
-          <w:bCs/>
+          <w:b w:val="false"/>
+          <w:bCs w:val="false"/>
           <w:i w:val="false"/>
           <w:color w:val="1F2937"/>
           <w:sz w:val="22"/>
         </w:rPr>
-        <w:t>1</w:t>
-      </w:r>
-      <w:r>
-        <w:rPr>
-          <w:rFonts w:eastAsia="Calibri"/>
-          <w:b/>
-          <w:bCs/>
-          <w:i w:val="false"/>
-          <w:color w:val="1F2937"/>
-          <w:sz w:val="22"/>
-        </w:rPr>
-        <w:t xml:space="preserve"> CABECERA] -</w:t>
+        <w:t xml:space="preserve"> - </w:t>
       </w:r>
       <w:r>
         <w:rPr>
@@ -313,7 +302,135 @@
           <w:color w:val="1F2937"/>
           <w:sz w:val="22"/>
         </w:rPr>
-        <w:t xml:space="preserve"> [EXPERIENCIA </w:t>
+        <w:t>[EXPERIENCIA 1 DESCRIPCION]</w:t>
+      </w:r>
+    </w:p>
+    <w:p>
+      <w:pPr>
+        <w:pStyle w:val="Normal"/>
+        <w:spacing w:lineRule="auto" w:line="240" w:before="0" w:after="60"/>
+        <w:jc w:val="both"/>
+        <w:rPr>
+          <w:rFonts w:eastAsia="Calibri"/>
+          <w:b w:val="false"/>
+          <w:i w:val="false"/>
+          <w:color w:val="1F2937"/>
+          <w:sz w:val="22"/>
+        </w:rPr>
+      </w:pPr>
+      <w:r>
+        <w:rPr>
+          <w:rFonts w:eastAsia="Calibri"/>
+          <w:b/>
+          <w:bCs/>
+          <w:i w:val="false"/>
+          <w:color w:val="1F2937"/>
+          <w:sz w:val="22"/>
+        </w:rPr>
+        <w:t>[EXPERIENCIA 2 CABECERA]</w:t>
+      </w:r>
+      <w:r>
+        <w:rPr>
+          <w:rFonts w:eastAsia="Calibri"/>
+          <w:b w:val="false"/>
+          <w:bCs w:val="false"/>
+          <w:i w:val="false"/>
+          <w:color w:val="1F2937"/>
+          <w:sz w:val="22"/>
+        </w:rPr>
+        <w:t xml:space="preserve"> - </w:t>
+      </w:r>
+      <w:r>
+        <w:rPr>
+          <w:rFonts w:eastAsia="Calibri"/>
+          <w:b w:val="false"/>
+          <w:i w:val="false"/>
+          <w:color w:val="1F2937"/>
+          <w:sz w:val="22"/>
+        </w:rPr>
+        <w:t>[EXPERIENCIA 2 DESCRIPCION]</w:t>
+      </w:r>
+    </w:p>
+    <w:p>
+      <w:pPr>
+        <w:pStyle w:val="Normal"/>
+        <w:spacing w:lineRule="auto" w:line="240" w:before="0" w:after="60"/>
+        <w:jc w:val="both"/>
+        <w:rPr>
+          <w:rFonts w:eastAsia="Calibri"/>
+          <w:b w:val="false"/>
+          <w:i w:val="false"/>
+          <w:color w:val="1F2937"/>
+          <w:sz w:val="22"/>
+        </w:rPr>
+      </w:pPr>
+      <w:r>
+        <w:rPr>
+          <w:rFonts w:eastAsia="Calibri"/>
+          <w:b/>
+          <w:bCs/>
+          <w:i w:val="false"/>
+          <w:color w:val="1F2937"/>
+          <w:sz w:val="22"/>
+        </w:rPr>
+        <w:t>[EXPERIENCIA 3 CABECERA]</w:t>
+      </w:r>
+      <w:r>
+        <w:rPr>
+          <w:rFonts w:eastAsia="Calibri"/>
+          <w:b w:val="false"/>
+          <w:bCs w:val="false"/>
+          <w:i w:val="false"/>
+          <w:color w:val="1F2937"/>
+          <w:sz w:val="22"/>
+        </w:rPr>
+        <w:t xml:space="preserve"> - </w:t>
+      </w:r>
+      <w:r>
+        <w:rPr>
+          <w:rFonts w:eastAsia="Calibri"/>
+          <w:b w:val="false"/>
+          <w:i w:val="false"/>
+          <w:color w:val="1F2937"/>
+          <w:sz w:val="22"/>
+        </w:rPr>
+        <w:t>[EXPERIENCIA 3 DESCRIPCION]</w:t>
+      </w:r>
+    </w:p>
+    <w:p>
+      <w:pPr>
+        <w:pStyle w:val="Normal"/>
+        <w:spacing w:lineRule="auto" w:line="240" w:before="0" w:after="60"/>
+        <w:jc w:val="both"/>
+        <w:rPr>
+          <w:rFonts w:eastAsia="Calibri"/>
+          <w:b w:val="false"/>
+          <w:i w:val="false"/>
+          <w:color w:val="1F2937"/>
+          <w:sz w:val="22"/>
+        </w:rPr>
+      </w:pPr>
+      <w:r>
+        <w:rPr>
+          <w:rFonts w:eastAsia="Calibri"/>
+          <w:b/>
+          <w:bCs/>
+          <w:i w:val="false"/>
+          <w:color w:val="1F2937"/>
+          <w:sz w:val="22"/>
+        </w:rPr>
+        <w:t>[EXPERIENCIA 4 CABECERA]</w:t>
+      </w:r>
+      <w:r>
+        <w:rPr>
+          <w:rFonts w:eastAsia="Calibri"/>
+          <w:b w:val="false"/>
+          <w:bCs w:val="false"/>
+          <w:i w:val="false"/>
+          <w:color w:val="1F2937"/>
+          <w:sz w:val="22"/>
+        </w:rPr>
+        <w:t xml:space="preserve"> - </w:t>
       </w:r>
       <w:r>
         <w:rPr>
@@ -324,18 +441,7 @@
           <w:color w:val="1F2937"/>
           <w:sz w:val="22"/>
         </w:rPr>
-        <w:t>1</w:t>
-      </w:r>
-      <w:r>
-        <w:rPr>
-          <w:rFonts w:eastAsia="Calibri"/>
-          <w:b w:val="false"/>
-          <w:bCs/>
-          <w:i w:val="false"/>
-          <w:color w:val="1F2937"/>
-          <w:sz w:val="22"/>
-        </w:rPr>
-        <w:t xml:space="preserve"> DESCRIPCION]</w:t>
+        <w:t>[EXPERIENCIA 4 DESCRIPCION]</w:t>
       </w:r>
     </w:p>
     <w:p>
@@ -360,29 +466,18 @@
           <w:color w:val="1F2937"/>
           <w:sz w:val="22"/>
         </w:rPr>
-        <w:t xml:space="preserve">[EXPERIENCIA </w:t>
+        <w:t>[EXPERIENCIA 5 CABECERA]</w:t>
       </w:r>
       <w:r>
         <w:rPr>
           <w:rFonts w:eastAsia="Calibri"/>
-          <w:b/>
-          <w:bCs/>
+          <w:b w:val="false"/>
+          <w:bCs w:val="false"/>
           <w:i w:val="false"/>
           <w:color w:val="1F2937"/>
           <w:sz w:val="22"/>
         </w:rPr>
-        <w:t>2</w:t>
-      </w:r>
-      <w:r>
-        <w:rPr>
-          <w:rFonts w:eastAsia="Calibri"/>
-          <w:b/>
-          <w:bCs/>
-          <w:i w:val="false"/>
-          <w:color w:val="1F2937"/>
-          <w:sz w:val="22"/>
-        </w:rPr>
-        <w:t xml:space="preserve"> CABECERA] -</w:t>
+        <w:t xml:space="preserve"> - </w:t>
       </w:r>
       <w:r>
         <w:rPr>
@@ -392,27 +487,7 @@
           <w:color w:val="1F2937"/>
           <w:sz w:val="22"/>
         </w:rPr>
-        <w:t xml:space="preserve"> [EXPERIENCIA </w:t>
-      </w:r>
-      <w:r>
-        <w:rPr>
-          <w:rFonts w:eastAsia="Calibri"/>
-          <w:b w:val="false"/>
-          <w:i w:val="false"/>
-          <w:color w:val="1F2937"/>
-          <w:sz w:val="22"/>
-        </w:rPr>
-        <w:t>2</w:t>
-      </w:r>
-      <w:r>
-        <w:rPr>
-          <w:rFonts w:eastAsia="Calibri"/>
-          <w:b w:val="false"/>
-          <w:i w:val="false"/>
-          <w:color w:val="1F2937"/>
-          <w:sz w:val="22"/>
-        </w:rPr>
-        <w:t xml:space="preserve"> DESCRIPCION]</w:t>
+        <w:t>[EXPERIENCIA 5 DESCRIPCION]</w:t>
       </w:r>
     </w:p>
     <w:p>
@@ -437,29 +512,18 @@
           <w:color w:val="1F2937"/>
           <w:sz w:val="22"/>
         </w:rPr>
-        <w:t xml:space="preserve">[EXPERIENCIA </w:t>
+        <w:t>[EXPERIENCIA 6 CABECERA]</w:t>
       </w:r>
       <w:r>
         <w:rPr>
           <w:rFonts w:eastAsia="Calibri"/>
-          <w:b/>
-          <w:bCs/>
+          <w:b w:val="false"/>
+          <w:bCs w:val="false"/>
           <w:i w:val="false"/>
           <w:color w:val="1F2937"/>
           <w:sz w:val="22"/>
         </w:rPr>
-        <w:t>3</w:t>
-      </w:r>
-      <w:r>
-        <w:rPr>
-          <w:rFonts w:eastAsia="Calibri"/>
-          <w:b/>
-          <w:bCs/>
-          <w:i w:val="false"/>
-          <w:color w:val="1F2937"/>
-          <w:sz w:val="22"/>
-        </w:rPr>
-        <w:t xml:space="preserve"> CABECERA] -</w:t>
+        <w:t xml:space="preserve"> - </w:t>
       </w:r>
       <w:r>
         <w:rPr>
@@ -469,230 +533,7 @@
           <w:color w:val="1F2937"/>
           <w:sz w:val="22"/>
         </w:rPr>
-        <w:t xml:space="preserve"> [EXPERIENCIA </w:t>
-      </w:r>
-      <w:r>
-        <w:rPr>
-          <w:rFonts w:eastAsia="Calibri"/>
-          <w:b w:val="false"/>
-          <w:i w:val="false"/>
-          <w:color w:val="1F2937"/>
-          <w:sz w:val="22"/>
-        </w:rPr>
-        <w:t>3</w:t>
-      </w:r>
-      <w:r>
-        <w:rPr>
-          <w:rFonts w:eastAsia="Calibri"/>
-          <w:b w:val="false"/>
-          <w:i w:val="false"/>
-          <w:color w:val="1F2937"/>
-          <w:sz w:val="22"/>
-        </w:rPr>
-        <w:t xml:space="preserve"> DESCRIPCION]</w:t>
-      </w:r>
-    </w:p>
-    <w:p>
-      <w:pPr>
-        <w:pStyle w:val="Normal"/>
-        <w:spacing w:lineRule="auto" w:line="240" w:before="0" w:after="60"/>
-        <w:jc w:val="both"/>
-        <w:rPr>
-          <w:rFonts w:eastAsia="Calibri"/>
-          <w:b w:val="false"/>
-          <w:i w:val="false"/>
-          <w:color w:val="1F2937"/>
-          <w:sz w:val="22"/>
-        </w:rPr>
-      </w:pPr>
-      <w:r>
-        <w:rPr>
-          <w:rFonts w:eastAsia="Calibri"/>
-          <w:b/>
-          <w:bCs/>
-          <w:i w:val="false"/>
-          <w:color w:val="1F2937"/>
-          <w:sz w:val="22"/>
-        </w:rPr>
-        <w:t xml:space="preserve">[EXPERIENCIA </w:t>
-      </w:r>
-      <w:r>
-        <w:rPr>
-          <w:rFonts w:eastAsia="Calibri"/>
-          <w:b/>
-          <w:bCs/>
-          <w:i w:val="false"/>
-          <w:color w:val="1F2937"/>
-          <w:sz w:val="22"/>
-        </w:rPr>
-        <w:t>4</w:t>
-      </w:r>
-      <w:r>
-        <w:rPr>
-          <w:rFonts w:eastAsia="Calibri"/>
-          <w:b/>
-          <w:bCs/>
-          <w:i w:val="false"/>
-          <w:color w:val="1F2937"/>
-          <w:sz w:val="22"/>
-        </w:rPr>
-        <w:t xml:space="preserve"> CABECERA] -</w:t>
-      </w:r>
-      <w:r>
-        <w:rPr>
-          <w:rFonts w:eastAsia="Calibri"/>
-          <w:b w:val="false"/>
-          <w:bCs/>
-          <w:i w:val="false"/>
-          <w:color w:val="1F2937"/>
-          <w:sz w:val="22"/>
-        </w:rPr>
-        <w:t xml:space="preserve"> [EXPERIENCIA </w:t>
-      </w:r>
-      <w:r>
-        <w:rPr>
-          <w:rFonts w:eastAsia="Calibri"/>
-          <w:b w:val="false"/>
-          <w:bCs/>
-          <w:i w:val="false"/>
-          <w:color w:val="1F2937"/>
-          <w:sz w:val="22"/>
-        </w:rPr>
-        <w:t>4</w:t>
-      </w:r>
-      <w:r>
-        <w:rPr>
-          <w:rFonts w:eastAsia="Calibri"/>
-          <w:b w:val="false"/>
-          <w:bCs/>
-          <w:i w:val="false"/>
-          <w:color w:val="1F2937"/>
-          <w:sz w:val="22"/>
-        </w:rPr>
-        <w:t xml:space="preserve"> DESCRIPCION]</w:t>
-      </w:r>
-    </w:p>
-    <w:p>
-      <w:pPr>
-        <w:pStyle w:val="Normal"/>
-        <w:spacing w:lineRule="auto" w:line="240" w:before="0" w:after="60"/>
-        <w:jc w:val="both"/>
-        <w:rPr>
-          <w:rFonts w:eastAsia="Calibri"/>
-          <w:b w:val="false"/>
-          <w:i w:val="false"/>
-          <w:color w:val="1F2937"/>
-          <w:sz w:val="22"/>
-        </w:rPr>
-      </w:pPr>
-      <w:r>
-        <w:rPr>
-          <w:rFonts w:eastAsia="Calibri"/>
-          <w:b/>
-          <w:bCs/>
-          <w:i w:val="false"/>
-          <w:color w:val="1F2937"/>
-          <w:sz w:val="22"/>
-        </w:rPr>
-        <w:t xml:space="preserve">[EXPERIENCIA </w:t>
-      </w:r>
-      <w:r>
-        <w:rPr>
-          <w:rFonts w:eastAsia="Calibri"/>
-          <w:b/>
-          <w:bCs/>
-          <w:i w:val="false"/>
-          <w:color w:val="1F2937"/>
-          <w:sz w:val="22"/>
-        </w:rPr>
-        <w:t>5</w:t>
-      </w:r>
-      <w:r>
-        <w:rPr>
-          <w:rFonts w:eastAsia="Calibri"/>
-          <w:b/>
-          <w:bCs/>
-          <w:i w:val="false"/>
-          <w:color w:val="1F2937"/>
-          <w:sz w:val="22"/>
-        </w:rPr>
-        <w:t xml:space="preserve"> CABECERA]</w:t>
-      </w:r>
-      <w:r>
-        <w:rPr>
-          <w:rFonts w:eastAsia="Calibri"/>
-          <w:b/>
-          <w:bCs/>
-          <w:i w:val="false"/>
-          <w:color w:val="1F2937"/>
-          <w:sz w:val="22"/>
-        </w:rPr>
-        <w:t xml:space="preserve"> -</w:t>
-      </w:r>
-      <w:r>
-        <w:rPr>
-          <w:rFonts w:eastAsia="Calibri"/>
-          <w:b w:val="false"/>
-          <w:i w:val="false"/>
-          <w:color w:val="1F2937"/>
-          <w:sz w:val="22"/>
-        </w:rPr>
-        <w:t xml:space="preserve"> [EXPERIENCIA </w:t>
-      </w:r>
-      <w:r>
-        <w:rPr>
-          <w:rFonts w:eastAsia="Calibri"/>
-          <w:b w:val="false"/>
-          <w:i w:val="false"/>
-          <w:color w:val="1F2937"/>
-          <w:sz w:val="22"/>
-        </w:rPr>
-        <w:t>5</w:t>
-      </w:r>
-      <w:r>
-        <w:rPr>
-          <w:rFonts w:eastAsia="Calibri"/>
-          <w:b w:val="false"/>
-          <w:i w:val="false"/>
-          <w:color w:val="1F2937"/>
-          <w:sz w:val="22"/>
-        </w:rPr>
-        <w:t xml:space="preserve"> DESCRIPCION]</w:t>
-      </w:r>
-    </w:p>
-    <w:p>
-      <w:pPr>
-        <w:pStyle w:val="Normal"/>
-        <w:spacing w:lineRule="auto" w:line="240" w:before="0" w:after="60"/>
-        <w:jc w:val="both"/>
-        <w:rPr>
-          <w:rFonts w:eastAsia="Calibri"/>
-          <w:b w:val="false"/>
-          <w:i w:val="false"/>
-          <w:color w:val="1F2937"/>
-          <w:sz w:val="22"/>
-        </w:rPr>
-      </w:pPr>
-      <w:r>
-        <w:rPr>
-          <w:rFonts w:eastAsia="Calibri"/>
-          <w:b/>
-          <w:bCs/>
-          <w:i w:val="false"/>
-          <w:color w:val="1F2937"/>
-          <w:sz w:val="22"/>
-        </w:rPr>
-        <w:t>[EXPERIENCIA 6 CABECERA] -</w:t>
-      </w:r>
-      <w:r>
-        <w:rPr>
-          <w:rFonts w:eastAsia="Calibri"/>
-          <w:b w:val="false"/>
-          <w:i w:val="false"/>
-          <w:color w:val="1F2937"/>
-          <w:sz w:val="22"/>
-        </w:rPr>
-        <w:t xml:space="preserve"> [EXPERIENCIA 6 DESCRIPCION]</w:t>
+        <w:t>[EXPERIENCIA 6 DESCRIPCION]</w:t>
       </w:r>
     </w:p>
     <w:p>
@@ -989,14 +830,7 @@
       <w:rPr/>
     </w:pPr>
     <w:r>
-      <w:rPr>
-        <w:rFonts w:eastAsia="Calibri"/>
-        <w:b w:val="false"/>
-        <w:i w:val="false"/>
-        <w:color w:val="5B6573"/>
-        <w:sz w:val="18"/>
-      </w:rPr>
-      <w:t/>
+      <w:rPr/>
     </w:r>
   </w:p>
 </w:ftr>
@@ -1012,14 +846,7 @@
       <w:rPr/>
     </w:pPr>
     <w:r>
-      <w:rPr>
-        <w:rFonts w:eastAsia="Calibri"/>
-        <w:b w:val="false"/>
-        <w:i w:val="false"/>
-        <w:color w:val="5B6573"/>
-        <w:sz w:val="18"/>
-      </w:rPr>
-      <w:t/>
+      <w:rPr/>
     </w:r>
   </w:p>
 </w:ftr>
@@ -2764,8 +2591,8 @@
       <w:spacing w:val="5"/>
     </w:rPr>
   </w:style>
-  <w:style w:type="character" w:styleId="Bolosuser">
-    <w:name w:val="Bolos (user)"/>
+  <w:style w:type="character" w:styleId="Bolos">
+    <w:name w:val="Bolos"/>
     <w:qFormat/>
     <w:rPr>
       <w:rFonts w:ascii="OpenSymbol" w:hAnsi="OpenSymbol" w:eastAsia="OpenSymbol" w:cs="OpenSymbol"/>
@@ -2868,15 +2695,15 @@
       <w:rFonts w:cs="Lucida Sans"/>
     </w:rPr>
   </w:style>
-  <w:style w:type="paragraph" w:styleId="Cabeceraypie">
-    <w:name w:val="Cabecera y pie"/>
+  <w:style w:type="paragraph" w:styleId="Cabeceraypieuser">
+    <w:name w:val="Cabecera y pie (user)"/>
     <w:basedOn w:val="Normal"/>
     <w:qFormat/>
     <w:pPr/>
     <w:rPr/>
   </w:style>
-  <w:style w:type="paragraph" w:styleId="Cabeceraypieuser">
-    <w:name w:val="Cabecera y pie (user)"/>
+  <w:style w:type="paragraph" w:styleId="Cabeceraypie">
+    <w:name w:val="Cabecera y pie"/>
     <w:basedOn w:val="Normal"/>
     <w:qFormat/>
     <w:pPr/>
@@ -3258,7 +3085,7 @@
   </w:style>
   <w:style w:type="paragraph" w:styleId="IndexHeading">
     <w:name w:val="index heading"/>
-    <w:basedOn w:val="Ttulo"/>
+    <w:basedOn w:val="Ttulouser"/>
     <w:pPr/>
     <w:rPr/>
   </w:style>
@@ -3276,8 +3103,8 @@
     </w:pPr>
     <w:rPr/>
   </w:style>
-  <w:style w:type="numbering" w:styleId="Ningunalista" w:default="1">
-    <w:name w:val="Ninguna lista"/>
+  <w:style w:type="numbering" w:styleId="Ningunalistauser" w:default="1">
+    <w:name w:val="Ninguna lista (user)"/>
     <w:uiPriority w:val="99"/>
     <w:semiHidden/>
     <w:unhideWhenUsed/>

</xml_diff>